<commit_message>
feat(docx-template-report): tech-guide模板扩展2-5列表格 + 新增渲染示例脚本
</commit_message>
<xml_diff>
--- a/.agents/skills/docx-template-report/templates/tech-guide-template.docx
+++ b/.agents/skills/docx-template-report/templates/tech-guide-template.docx
@@ -256,7 +256,165 @@
     </w:p>
     <w:p>
       <w:r>
-        <w:t>{% if sec.table %}</w:t>
+        <w:t>{% for tbl in sec.tables %}</w:t>
+      </w:r>
+    </w:p>
+    <w:p>
+      <w:r>
+        <w:t>{% if tbl.cols == 2 %}</w:t>
+      </w:r>
+    </w:p>
+    <w:tbl>
+      <w:tblPr>
+        <w:tblStyle w:val="TableGrid"/>
+        <w:tblW w:type="auto" w:w="0"/>
+        <w:tblLook w:firstColumn="1" w:firstRow="1" w:lastColumn="0" w:lastRow="0" w:noHBand="0" w:noVBand="1" w:val="04A0"/>
+      </w:tblPr>
+      <w:tblGrid>
+        <w:gridCol w:w="4320"/>
+        <w:gridCol w:w="4320"/>
+      </w:tblGrid>
+      <w:tr>
+        <w:tc>
+          <w:tcPr>
+            <w:tcW w:type="dxa" w:w="4320"/>
+          </w:tcPr>
+          <w:p>
+            <w:r>
+              <w:t>{{ tbl.headers[0] }}</w:t>
+            </w:r>
+          </w:p>
+        </w:tc>
+        <w:tc>
+          <w:tcPr>
+            <w:tcW w:type="dxa" w:w="4320"/>
+          </w:tcPr>
+          <w:p>
+            <w:r>
+              <w:t>{{ tbl.headers[1] }}</w:t>
+            </w:r>
+          </w:p>
+        </w:tc>
+      </w:tr>
+      <w:tr>
+        <w:tc>
+          <w:tcPr>
+            <w:tcW w:type="dxa" w:w="4320"/>
+          </w:tcPr>
+          <w:p>
+            <w:r>
+              <w:t>{% for r in tbl.rows %}{{ r[0] }}</w:t>
+            </w:r>
+          </w:p>
+        </w:tc>
+        <w:tc>
+          <w:tcPr>
+            <w:tcW w:type="dxa" w:w="4320"/>
+          </w:tcPr>
+          <w:p>
+            <w:r>
+              <w:t>{{ r[1] }}{% endfor %}</w:t>
+            </w:r>
+          </w:p>
+        </w:tc>
+      </w:tr>
+    </w:tbl>
+    <w:p/>
+    <w:p>
+      <w:r>
+        <w:t>{% endif %}</w:t>
+      </w:r>
+    </w:p>
+    <w:p>
+      <w:r>
+        <w:t>{% if tbl.cols == 3 %}</w:t>
+      </w:r>
+    </w:p>
+    <w:tbl>
+      <w:tblPr>
+        <w:tblStyle w:val="TableGrid"/>
+        <w:tblW w:type="auto" w:w="0"/>
+        <w:tblLook w:firstColumn="1" w:firstRow="1" w:lastColumn="0" w:lastRow="0" w:noHBand="0" w:noVBand="1" w:val="04A0"/>
+      </w:tblPr>
+      <w:tblGrid>
+        <w:gridCol w:w="2880"/>
+        <w:gridCol w:w="2880"/>
+        <w:gridCol w:w="2880"/>
+      </w:tblGrid>
+      <w:tr>
+        <w:tc>
+          <w:tcPr>
+            <w:tcW w:type="dxa" w:w="2880"/>
+          </w:tcPr>
+          <w:p>
+            <w:r>
+              <w:t>{{ tbl.headers[0] }}</w:t>
+            </w:r>
+          </w:p>
+        </w:tc>
+        <w:tc>
+          <w:tcPr>
+            <w:tcW w:type="dxa" w:w="2880"/>
+          </w:tcPr>
+          <w:p>
+            <w:r>
+              <w:t>{{ tbl.headers[1] }}</w:t>
+            </w:r>
+          </w:p>
+        </w:tc>
+        <w:tc>
+          <w:tcPr>
+            <w:tcW w:type="dxa" w:w="2880"/>
+          </w:tcPr>
+          <w:p>
+            <w:r>
+              <w:t>{{ tbl.headers[2] }}</w:t>
+            </w:r>
+          </w:p>
+        </w:tc>
+      </w:tr>
+      <w:tr>
+        <w:tc>
+          <w:tcPr>
+            <w:tcW w:type="dxa" w:w="2880"/>
+          </w:tcPr>
+          <w:p>
+            <w:r>
+              <w:t>{% for r in tbl.rows %}{{ r[0] }}</w:t>
+            </w:r>
+          </w:p>
+        </w:tc>
+        <w:tc>
+          <w:tcPr>
+            <w:tcW w:type="dxa" w:w="2880"/>
+          </w:tcPr>
+          <w:p>
+            <w:r>
+              <w:t>{{ r[1] }}</w:t>
+            </w:r>
+          </w:p>
+        </w:tc>
+        <w:tc>
+          <w:tcPr>
+            <w:tcW w:type="dxa" w:w="2880"/>
+          </w:tcPr>
+          <w:p>
+            <w:r>
+              <w:t>{{ r[2] }}{% endfor %}</w:t>
+            </w:r>
+          </w:p>
+        </w:tc>
+      </w:tr>
+    </w:tbl>
+    <w:p/>
+    <w:p>
+      <w:r>
+        <w:t>{% endif %}</w:t>
+      </w:r>
+    </w:p>
+    <w:p>
+      <w:r>
+        <w:t>{% if tbl.cols == 4 %}</w:t>
       </w:r>
     </w:p>
     <w:tbl>
@@ -278,7 +436,7 @@
           </w:tcPr>
           <w:p>
             <w:r>
-              <w:t>{{ sec.table.headers[0] }}</w:t>
+              <w:t>{{ tbl.headers[0] }}</w:t>
             </w:r>
           </w:p>
         </w:tc>
@@ -288,7 +446,7 @@
           </w:tcPr>
           <w:p>
             <w:r>
-              <w:t>{{ sec.table.headers[1] }}</w:t>
+              <w:t>{{ tbl.headers[1] }}</w:t>
             </w:r>
           </w:p>
         </w:tc>
@@ -298,7 +456,7 @@
           </w:tcPr>
           <w:p>
             <w:r>
-              <w:t>{{ sec.table.headers[2] }}</w:t>
+              <w:t>{{ tbl.headers[2] }}</w:t>
             </w:r>
           </w:p>
         </w:tc>
@@ -308,7 +466,7 @@
           </w:tcPr>
           <w:p>
             <w:r>
-              <w:t>{{ sec.table.headers[3] }}</w:t>
+              <w:t>{{ tbl.headers[3] }}</w:t>
             </w:r>
           </w:p>
         </w:tc>
@@ -320,7 +478,7 @@
           </w:tcPr>
           <w:p>
             <w:r>
-              <w:t>{% for r in sec.table.rows %}{{ r[0] }}</w:t>
+              <w:t>{% for r in tbl.rows %}{{ r[0] }}</w:t>
             </w:r>
           </w:p>
         </w:tc>
@@ -360,6 +518,140 @@
     <w:p>
       <w:r>
         <w:t>{% endif %}</w:t>
+      </w:r>
+    </w:p>
+    <w:p>
+      <w:r>
+        <w:t>{% if tbl.cols == 5 %}</w:t>
+      </w:r>
+    </w:p>
+    <w:tbl>
+      <w:tblPr>
+        <w:tblStyle w:val="TableGrid"/>
+        <w:tblW w:type="auto" w:w="0"/>
+        <w:tblLook w:firstColumn="1" w:firstRow="1" w:lastColumn="0" w:lastRow="0" w:noHBand="0" w:noVBand="1" w:val="04A0"/>
+      </w:tblPr>
+      <w:tblGrid>
+        <w:gridCol w:w="1728"/>
+        <w:gridCol w:w="1728"/>
+        <w:gridCol w:w="1728"/>
+        <w:gridCol w:w="1728"/>
+        <w:gridCol w:w="1728"/>
+      </w:tblGrid>
+      <w:tr>
+        <w:tc>
+          <w:tcPr>
+            <w:tcW w:type="dxa" w:w="1728"/>
+          </w:tcPr>
+          <w:p>
+            <w:r>
+              <w:t>{{ tbl.headers[0] }}</w:t>
+            </w:r>
+          </w:p>
+        </w:tc>
+        <w:tc>
+          <w:tcPr>
+            <w:tcW w:type="dxa" w:w="1728"/>
+          </w:tcPr>
+          <w:p>
+            <w:r>
+              <w:t>{{ tbl.headers[1] }}</w:t>
+            </w:r>
+          </w:p>
+        </w:tc>
+        <w:tc>
+          <w:tcPr>
+            <w:tcW w:type="dxa" w:w="1728"/>
+          </w:tcPr>
+          <w:p>
+            <w:r>
+              <w:t>{{ tbl.headers[2] }}</w:t>
+            </w:r>
+          </w:p>
+        </w:tc>
+        <w:tc>
+          <w:tcPr>
+            <w:tcW w:type="dxa" w:w="1728"/>
+          </w:tcPr>
+          <w:p>
+            <w:r>
+              <w:t>{{ tbl.headers[3] }}</w:t>
+            </w:r>
+          </w:p>
+        </w:tc>
+        <w:tc>
+          <w:tcPr>
+            <w:tcW w:type="dxa" w:w="1728"/>
+          </w:tcPr>
+          <w:p>
+            <w:r>
+              <w:t>{{ tbl.headers[4] }}</w:t>
+            </w:r>
+          </w:p>
+        </w:tc>
+      </w:tr>
+      <w:tr>
+        <w:tc>
+          <w:tcPr>
+            <w:tcW w:type="dxa" w:w="1728"/>
+          </w:tcPr>
+          <w:p>
+            <w:r>
+              <w:t>{% for r in tbl.rows %}{{ r[0] }}</w:t>
+            </w:r>
+          </w:p>
+        </w:tc>
+        <w:tc>
+          <w:tcPr>
+            <w:tcW w:type="dxa" w:w="1728"/>
+          </w:tcPr>
+          <w:p>
+            <w:r>
+              <w:t>{{ r[1] }}</w:t>
+            </w:r>
+          </w:p>
+        </w:tc>
+        <w:tc>
+          <w:tcPr>
+            <w:tcW w:type="dxa" w:w="1728"/>
+          </w:tcPr>
+          <w:p>
+            <w:r>
+              <w:t>{{ r[2] }}</w:t>
+            </w:r>
+          </w:p>
+        </w:tc>
+        <w:tc>
+          <w:tcPr>
+            <w:tcW w:type="dxa" w:w="1728"/>
+          </w:tcPr>
+          <w:p>
+            <w:r>
+              <w:t>{{ r[3] }}</w:t>
+            </w:r>
+          </w:p>
+        </w:tc>
+        <w:tc>
+          <w:tcPr>
+            <w:tcW w:type="dxa" w:w="1728"/>
+          </w:tcPr>
+          <w:p>
+            <w:r>
+              <w:t>{{ r[4] }}{% endfor %}</w:t>
+            </w:r>
+          </w:p>
+        </w:tc>
+      </w:tr>
+    </w:tbl>
+    <w:p/>
+    <w:p>
+      <w:r>
+        <w:t>{% endif %}</w:t>
+      </w:r>
+    </w:p>
+    <w:p>
+      <w:r>
+        <w:t>{% endfor %}</w:t>
       </w:r>
     </w:p>
     <w:p>

</xml_diff>

<commit_message>
refactor(docx-template-report): 调整封面布局(版本号右上角)+统一字号体系(正文/表格11pt,H1 16pt,H2 13pt)
</commit_message>
<xml_diff>
--- a/.agents/skills/docx-template-report/templates/tech-guide-template.docx
+++ b/.agents/skills/docx-template-report/templates/tech-guide-template.docx
@@ -23,11 +23,10 @@
             <w:r>
               <w:rPr>
                 <w:rFonts w:ascii="微软雅黑" w:hAnsi="微软雅黑" w:eastAsia="微软雅黑"/>
-                <w:b/>
-                <w:color w:val="1F4E79"/>
+                <w:color w:val="808080"/>
                 <w:sz w:val="22"/>
               </w:rPr>
-              <w:t>{{ doc_meta }}</w:t>
+              <w:t>{{ company }}</w:t>
             </w:r>
           </w:p>
         </w:tc>
@@ -42,10 +41,11 @@
             <w:r>
               <w:rPr>
                 <w:rFonts w:ascii="微软雅黑" w:hAnsi="微软雅黑" w:eastAsia="微软雅黑"/>
-                <w:color w:val="808080"/>
-                <w:sz w:val="21"/>
+                <w:b/>
+                <w:color w:val="1F4E79"/>
+                <w:sz w:val="22"/>
               </w:rPr>
-              <w:t>{{ company }}</w:t>
+              <w:t>版本 {{ doc_version }}</w:t>
             </w:r>
           </w:p>
         </w:tc>
@@ -72,7 +72,7 @@
           <w:rFonts w:ascii="微软雅黑" w:hAnsi="微软雅黑" w:eastAsia="微软雅黑"/>
           <w:b/>
           <w:color w:val="1F4E79"/>
-          <w:sz w:val="56"/>
+          <w:sz w:val="48"/>
         </w:rPr>
         <w:t>{{ doc_title }}</w:t>
       </w:r>
@@ -123,7 +123,7 @@
                 <w:rFonts w:ascii="微软雅黑" w:hAnsi="微软雅黑" w:eastAsia="微软雅黑"/>
                 <w:b/>
                 <w:color w:val="1F4E79"/>
-                <w:sz w:val="21"/>
+                <w:sz w:val="22"/>
               </w:rPr>
               <w:t>文件状态</w:t>
             </w:r>
@@ -157,7 +157,7 @@
                 <w:rFonts w:ascii="微软雅黑" w:hAnsi="微软雅黑" w:eastAsia="微软雅黑"/>
                 <w:b w:val="0"/>
                 <w:color w:val="333333"/>
-                <w:sz w:val="21"/>
+                <w:sz w:val="22"/>
               </w:rPr>
               <w:t>{{ doc_status }}</w:t>
             </w:r>
@@ -193,7 +193,7 @@
                 <w:rFonts w:ascii="微软雅黑" w:hAnsi="微软雅黑" w:eastAsia="微软雅黑"/>
                 <w:b/>
                 <w:color w:val="1F4E79"/>
-                <w:sz w:val="21"/>
+                <w:sz w:val="22"/>
               </w:rPr>
               <w:t>当前版本</w:t>
             </w:r>
@@ -227,7 +227,7 @@
                 <w:rFonts w:ascii="微软雅黑" w:hAnsi="微软雅黑" w:eastAsia="微软雅黑"/>
                 <w:b w:val="0"/>
                 <w:color w:val="333333"/>
-                <w:sz w:val="21"/>
+                <w:sz w:val="22"/>
               </w:rPr>
               <w:t>{{ doc_version }}</w:t>
             </w:r>
@@ -263,7 +263,7 @@
                 <w:rFonts w:ascii="微软雅黑" w:hAnsi="微软雅黑" w:eastAsia="微软雅黑"/>
                 <w:b/>
                 <w:color w:val="1F4E79"/>
-                <w:sz w:val="21"/>
+                <w:sz w:val="22"/>
               </w:rPr>
               <w:t>发布日期</w:t>
             </w:r>
@@ -297,7 +297,7 @@
                 <w:rFonts w:ascii="微软雅黑" w:hAnsi="微软雅黑" w:eastAsia="微软雅黑"/>
                 <w:b w:val="0"/>
                 <w:color w:val="333333"/>
-                <w:sz w:val="21"/>
+                <w:sz w:val="22"/>
               </w:rPr>
               <w:t>{{ doc_date }}</w:t>
             </w:r>
@@ -333,7 +333,7 @@
                 <w:rFonts w:ascii="微软雅黑" w:hAnsi="微软雅黑" w:eastAsia="微软雅黑"/>
                 <w:b/>
                 <w:color w:val="1F4E79"/>
-                <w:sz w:val="21"/>
+                <w:sz w:val="22"/>
               </w:rPr>
               <w:t>文档作者</w:t>
             </w:r>
@@ -367,7 +367,7 @@
                 <w:rFonts w:ascii="微软雅黑" w:hAnsi="微软雅黑" w:eastAsia="微软雅黑"/>
                 <w:b w:val="0"/>
                 <w:color w:val="333333"/>
-                <w:sz w:val="21"/>
+                <w:sz w:val="22"/>
               </w:rPr>
               <w:t>{{ doc_author }}</w:t>
             </w:r>
@@ -440,7 +440,7 @@
                 <w:rFonts w:ascii="微软雅黑" w:hAnsi="微软雅黑" w:eastAsia="微软雅黑"/>
                 <w:b/>
                 <w:color w:val="FFFFFF"/>
-                <w:sz w:val="21"/>
+                <w:sz w:val="22"/>
               </w:rPr>
               <w:t>版本号</w:t>
             </w:r>
@@ -474,7 +474,7 @@
                 <w:rFonts w:ascii="微软雅黑" w:hAnsi="微软雅黑" w:eastAsia="微软雅黑"/>
                 <w:b/>
                 <w:color w:val="FFFFFF"/>
-                <w:sz w:val="21"/>
+                <w:sz w:val="22"/>
               </w:rPr>
               <w:t>作者</w:t>
             </w:r>
@@ -508,7 +508,7 @@
                 <w:rFonts w:ascii="微软雅黑" w:hAnsi="微软雅黑" w:eastAsia="微软雅黑"/>
                 <w:b/>
                 <w:color w:val="FFFFFF"/>
-                <w:sz w:val="21"/>
+                <w:sz w:val="22"/>
               </w:rPr>
               <w:t>日期</w:t>
             </w:r>
@@ -542,7 +542,7 @@
                 <w:rFonts w:ascii="微软雅黑" w:hAnsi="微软雅黑" w:eastAsia="微软雅黑"/>
                 <w:b/>
                 <w:color w:val="FFFFFF"/>
-                <w:sz w:val="21"/>
+                <w:sz w:val="22"/>
               </w:rPr>
               <w:t>说明</w:t>
             </w:r>
@@ -576,7 +576,7 @@
                 <w:rFonts w:ascii="微软雅黑" w:hAnsi="微软雅黑" w:eastAsia="微软雅黑"/>
                 <w:b/>
                 <w:color w:val="FFFFFF"/>
-                <w:sz w:val="21"/>
+                <w:sz w:val="22"/>
               </w:rPr>
               <w:t>审批人</w:t>
             </w:r>
@@ -618,7 +618,7 @@
               <w:rPr>
                 <w:rFonts w:ascii="微软雅黑" w:hAnsi="微软雅黑" w:eastAsia="微软雅黑"/>
                 <w:color w:val="333333"/>
-                <w:sz w:val="21"/>
+                <w:sz w:val="22"/>
               </w:rPr>
               <w:t>{{ r.version }}</w:t>
             </w:r>
@@ -647,7 +647,7 @@
               <w:rPr>
                 <w:rFonts w:ascii="微软雅黑" w:hAnsi="微软雅黑" w:eastAsia="微软雅黑"/>
                 <w:color w:val="333333"/>
-                <w:sz w:val="21"/>
+                <w:sz w:val="22"/>
               </w:rPr>
               <w:t>{{ r.author }}</w:t>
             </w:r>
@@ -676,7 +676,7 @@
               <w:rPr>
                 <w:rFonts w:ascii="微软雅黑" w:hAnsi="微软雅黑" w:eastAsia="微软雅黑"/>
                 <w:color w:val="333333"/>
-                <w:sz w:val="21"/>
+                <w:sz w:val="22"/>
               </w:rPr>
               <w:t>{{ r.date }}</w:t>
             </w:r>
@@ -705,7 +705,7 @@
               <w:rPr>
                 <w:rFonts w:ascii="微软雅黑" w:hAnsi="微软雅黑" w:eastAsia="微软雅黑"/>
                 <w:color w:val="333333"/>
-                <w:sz w:val="21"/>
+                <w:sz w:val="22"/>
               </w:rPr>
               <w:t>{{ r.desc }}</w:t>
             </w:r>
@@ -734,7 +734,7 @@
               <w:rPr>
                 <w:rFonts w:ascii="微软雅黑" w:hAnsi="微软雅黑" w:eastAsia="微软雅黑"/>
                 <w:color w:val="333333"/>
-                <w:sz w:val="21"/>
+                <w:sz w:val="22"/>
               </w:rPr>
               <w:t>{{ r.approver }}</w:t>
             </w:r>
@@ -780,7 +780,7 @@
           <w:rFonts w:ascii="微软雅黑" w:hAnsi="微软雅黑" w:eastAsia="微软雅黑"/>
           <w:b/>
           <w:color w:val="1F4E79"/>
-          <w:sz w:val="36"/>
+          <w:sz w:val="32"/>
         </w:rPr>
         <w:t>{{ ch.title }}</w:t>
       </w:r>
@@ -800,7 +800,7 @@
         <w:rPr>
           <w:rFonts w:ascii="微软雅黑" w:hAnsi="微软雅黑" w:eastAsia="微软雅黑"/>
           <w:color w:val="333333"/>
-          <w:sz w:val="21"/>
+          <w:sz w:val="22"/>
         </w:rPr>
         <w:t>{{ p }}</w:t>
       </w:r>
@@ -834,7 +834,7 @@
           <w:rFonts w:ascii="微软雅黑" w:hAnsi="微软雅黑" w:eastAsia="微软雅黑"/>
           <w:b/>
           <w:color w:val="2E75B6"/>
-          <w:sz w:val="28"/>
+          <w:sz w:val="26"/>
         </w:rPr>
         <w:t>{{ sec.title }}</w:t>
       </w:r>
@@ -854,7 +854,7 @@
         <w:rPr>
           <w:rFonts w:ascii="微软雅黑" w:hAnsi="微软雅黑" w:eastAsia="微软雅黑"/>
           <w:color w:val="333333"/>
-          <w:sz w:val="21"/>
+          <w:sz w:val="22"/>
         </w:rPr>
         <w:t>{{ p }}</w:t>
       </w:r>
@@ -889,7 +889,7 @@
         <w:rPr>
           <w:rFonts w:ascii="Consolas" w:hAnsi="Consolas" w:eastAsia="Consolas"/>
           <w:color w:val="333333"/>
-          <w:sz w:val="19"/>
+          <w:sz w:val="20"/>
         </w:rPr>
         <w:t>{{ c }}</w:t>
       </w:r>
@@ -964,7 +964,7 @@
                 <w:rFonts w:ascii="微软雅黑" w:hAnsi="微软雅黑" w:eastAsia="微软雅黑"/>
                 <w:b/>
                 <w:color w:val="FFFFFF"/>
-                <w:sz w:val="21"/>
+                <w:sz w:val="22"/>
               </w:rPr>
               <w:t>{{ tbl.headers[0] }}</w:t>
             </w:r>
@@ -998,7 +998,7 @@
                 <w:rFonts w:ascii="微软雅黑" w:hAnsi="微软雅黑" w:eastAsia="微软雅黑"/>
                 <w:b/>
                 <w:color w:val="FFFFFF"/>
-                <w:sz w:val="21"/>
+                <w:sz w:val="22"/>
               </w:rPr>
               <w:t>{{ tbl.headers[1] }}</w:t>
             </w:r>
@@ -1040,7 +1040,7 @@
               <w:rPr>
                 <w:rFonts w:ascii="微软雅黑" w:hAnsi="微软雅黑" w:eastAsia="微软雅黑"/>
                 <w:color w:val="333333"/>
-                <w:sz w:val="21"/>
+                <w:sz w:val="22"/>
               </w:rPr>
               <w:t>{{ row[0] }}</w:t>
             </w:r>
@@ -1069,7 +1069,7 @@
               <w:rPr>
                 <w:rFonts w:ascii="微软雅黑" w:hAnsi="微软雅黑" w:eastAsia="微软雅黑"/>
                 <w:color w:val="333333"/>
-                <w:sz w:val="21"/>
+                <w:sz w:val="22"/>
               </w:rPr>
               <w:t>{{ row[1] }}</w:t>
             </w:r>
@@ -1149,7 +1149,7 @@
                 <w:rFonts w:ascii="微软雅黑" w:hAnsi="微软雅黑" w:eastAsia="微软雅黑"/>
                 <w:b/>
                 <w:color w:val="FFFFFF"/>
-                <w:sz w:val="21"/>
+                <w:sz w:val="22"/>
               </w:rPr>
               <w:t>{{ tbl.headers[0] }}</w:t>
             </w:r>
@@ -1183,7 +1183,7 @@
                 <w:rFonts w:ascii="微软雅黑" w:hAnsi="微软雅黑" w:eastAsia="微软雅黑"/>
                 <w:b/>
                 <w:color w:val="FFFFFF"/>
-                <w:sz w:val="21"/>
+                <w:sz w:val="22"/>
               </w:rPr>
               <w:t>{{ tbl.headers[1] }}</w:t>
             </w:r>
@@ -1217,7 +1217,7 @@
                 <w:rFonts w:ascii="微软雅黑" w:hAnsi="微软雅黑" w:eastAsia="微软雅黑"/>
                 <w:b/>
                 <w:color w:val="FFFFFF"/>
-                <w:sz w:val="21"/>
+                <w:sz w:val="22"/>
               </w:rPr>
               <w:t>{{ tbl.headers[2] }}</w:t>
             </w:r>
@@ -1259,7 +1259,7 @@
               <w:rPr>
                 <w:rFonts w:ascii="微软雅黑" w:hAnsi="微软雅黑" w:eastAsia="微软雅黑"/>
                 <w:color w:val="333333"/>
-                <w:sz w:val="21"/>
+                <w:sz w:val="22"/>
               </w:rPr>
               <w:t>{{ row[0] }}</w:t>
             </w:r>
@@ -1288,7 +1288,7 @@
               <w:rPr>
                 <w:rFonts w:ascii="微软雅黑" w:hAnsi="微软雅黑" w:eastAsia="微软雅黑"/>
                 <w:color w:val="333333"/>
-                <w:sz w:val="21"/>
+                <w:sz w:val="22"/>
               </w:rPr>
               <w:t>{{ row[1] }}</w:t>
             </w:r>
@@ -1317,7 +1317,7 @@
               <w:rPr>
                 <w:rFonts w:ascii="微软雅黑" w:hAnsi="微软雅黑" w:eastAsia="微软雅黑"/>
                 <w:color w:val="333333"/>
-                <w:sz w:val="21"/>
+                <w:sz w:val="22"/>
               </w:rPr>
               <w:t>{{ row[2] }}</w:t>
             </w:r>
@@ -1398,7 +1398,7 @@
                 <w:rFonts w:ascii="微软雅黑" w:hAnsi="微软雅黑" w:eastAsia="微软雅黑"/>
                 <w:b/>
                 <w:color w:val="FFFFFF"/>
-                <w:sz w:val="21"/>
+                <w:sz w:val="22"/>
               </w:rPr>
               <w:t>{{ tbl.headers[0] }}</w:t>
             </w:r>
@@ -1432,7 +1432,7 @@
                 <w:rFonts w:ascii="微软雅黑" w:hAnsi="微软雅黑" w:eastAsia="微软雅黑"/>
                 <w:b/>
                 <w:color w:val="FFFFFF"/>
-                <w:sz w:val="21"/>
+                <w:sz w:val="22"/>
               </w:rPr>
               <w:t>{{ tbl.headers[1] }}</w:t>
             </w:r>
@@ -1466,7 +1466,7 @@
                 <w:rFonts w:ascii="微软雅黑" w:hAnsi="微软雅黑" w:eastAsia="微软雅黑"/>
                 <w:b/>
                 <w:color w:val="FFFFFF"/>
-                <w:sz w:val="21"/>
+                <w:sz w:val="22"/>
               </w:rPr>
               <w:t>{{ tbl.headers[2] }}</w:t>
             </w:r>
@@ -1500,7 +1500,7 @@
                 <w:rFonts w:ascii="微软雅黑" w:hAnsi="微软雅黑" w:eastAsia="微软雅黑"/>
                 <w:b/>
                 <w:color w:val="FFFFFF"/>
-                <w:sz w:val="21"/>
+                <w:sz w:val="22"/>
               </w:rPr>
               <w:t>{{ tbl.headers[3] }}</w:t>
             </w:r>
@@ -1542,7 +1542,7 @@
               <w:rPr>
                 <w:rFonts w:ascii="微软雅黑" w:hAnsi="微软雅黑" w:eastAsia="微软雅黑"/>
                 <w:color w:val="333333"/>
-                <w:sz w:val="21"/>
+                <w:sz w:val="22"/>
               </w:rPr>
               <w:t>{{ row[0] }}</w:t>
             </w:r>
@@ -1571,7 +1571,7 @@
               <w:rPr>
                 <w:rFonts w:ascii="微软雅黑" w:hAnsi="微软雅黑" w:eastAsia="微软雅黑"/>
                 <w:color w:val="333333"/>
-                <w:sz w:val="21"/>
+                <w:sz w:val="22"/>
               </w:rPr>
               <w:t>{{ row[1] }}</w:t>
             </w:r>
@@ -1600,7 +1600,7 @@
               <w:rPr>
                 <w:rFonts w:ascii="微软雅黑" w:hAnsi="微软雅黑" w:eastAsia="微软雅黑"/>
                 <w:color w:val="333333"/>
-                <w:sz w:val="21"/>
+                <w:sz w:val="22"/>
               </w:rPr>
               <w:t>{{ row[2] }}</w:t>
             </w:r>
@@ -1629,7 +1629,7 @@
               <w:rPr>
                 <w:rFonts w:ascii="微软雅黑" w:hAnsi="微软雅黑" w:eastAsia="微软雅黑"/>
                 <w:color w:val="333333"/>
-                <w:sz w:val="21"/>
+                <w:sz w:val="22"/>
               </w:rPr>
               <w:t>{{ row[3] }}</w:t>
             </w:r>
@@ -1711,7 +1711,7 @@
                 <w:rFonts w:ascii="微软雅黑" w:hAnsi="微软雅黑" w:eastAsia="微软雅黑"/>
                 <w:b/>
                 <w:color w:val="FFFFFF"/>
-                <w:sz w:val="21"/>
+                <w:sz w:val="22"/>
               </w:rPr>
               <w:t>{{ tbl.headers[0] }}</w:t>
             </w:r>
@@ -1745,7 +1745,7 @@
                 <w:rFonts w:ascii="微软雅黑" w:hAnsi="微软雅黑" w:eastAsia="微软雅黑"/>
                 <w:b/>
                 <w:color w:val="FFFFFF"/>
-                <w:sz w:val="21"/>
+                <w:sz w:val="22"/>
               </w:rPr>
               <w:t>{{ tbl.headers[1] }}</w:t>
             </w:r>
@@ -1779,7 +1779,7 @@
                 <w:rFonts w:ascii="微软雅黑" w:hAnsi="微软雅黑" w:eastAsia="微软雅黑"/>
                 <w:b/>
                 <w:color w:val="FFFFFF"/>
-                <w:sz w:val="21"/>
+                <w:sz w:val="22"/>
               </w:rPr>
               <w:t>{{ tbl.headers[2] }}</w:t>
             </w:r>
@@ -1813,7 +1813,7 @@
                 <w:rFonts w:ascii="微软雅黑" w:hAnsi="微软雅黑" w:eastAsia="微软雅黑"/>
                 <w:b/>
                 <w:color w:val="FFFFFF"/>
-                <w:sz w:val="21"/>
+                <w:sz w:val="22"/>
               </w:rPr>
               <w:t>{{ tbl.headers[3] }}</w:t>
             </w:r>
@@ -1847,7 +1847,7 @@
                 <w:rFonts w:ascii="微软雅黑" w:hAnsi="微软雅黑" w:eastAsia="微软雅黑"/>
                 <w:b/>
                 <w:color w:val="FFFFFF"/>
-                <w:sz w:val="21"/>
+                <w:sz w:val="22"/>
               </w:rPr>
               <w:t>{{ tbl.headers[4] }}</w:t>
             </w:r>
@@ -1889,7 +1889,7 @@
               <w:rPr>
                 <w:rFonts w:ascii="微软雅黑" w:hAnsi="微软雅黑" w:eastAsia="微软雅黑"/>
                 <w:color w:val="333333"/>
-                <w:sz w:val="21"/>
+                <w:sz w:val="22"/>
               </w:rPr>
               <w:t>{{ row[0] }}</w:t>
             </w:r>
@@ -1918,7 +1918,7 @@
               <w:rPr>
                 <w:rFonts w:ascii="微软雅黑" w:hAnsi="微软雅黑" w:eastAsia="微软雅黑"/>
                 <w:color w:val="333333"/>
-                <w:sz w:val="21"/>
+                <w:sz w:val="22"/>
               </w:rPr>
               <w:t>{{ row[1] }}</w:t>
             </w:r>
@@ -1947,7 +1947,7 @@
               <w:rPr>
                 <w:rFonts w:ascii="微软雅黑" w:hAnsi="微软雅黑" w:eastAsia="微软雅黑"/>
                 <w:color w:val="333333"/>
-                <w:sz w:val="21"/>
+                <w:sz w:val="22"/>
               </w:rPr>
               <w:t>{{ row[2] }}</w:t>
             </w:r>
@@ -1976,7 +1976,7 @@
               <w:rPr>
                 <w:rFonts w:ascii="微软雅黑" w:hAnsi="微软雅黑" w:eastAsia="微软雅黑"/>
                 <w:color w:val="333333"/>
-                <w:sz w:val="21"/>
+                <w:sz w:val="22"/>
               </w:rPr>
               <w:t>{{ row[3] }}</w:t>
             </w:r>
@@ -2005,7 +2005,7 @@
               <w:rPr>
                 <w:rFonts w:ascii="微软雅黑" w:hAnsi="微软雅黑" w:eastAsia="微软雅黑"/>
                 <w:color w:val="333333"/>
-                <w:sz w:val="21"/>
+                <w:sz w:val="22"/>
               </w:rPr>
               <w:t>{{ row[4] }}</w:t>
             </w:r>
@@ -2443,7 +2443,7 @@
     <w:rPr>
       <w:rFonts w:ascii="微软雅黑" w:hAnsi="微软雅黑" w:eastAsia="微软雅黑"/>
       <w:color w:val="333333"/>
-      <w:sz w:val="21"/>
+      <w:sz w:val="22"/>
     </w:rPr>
   </w:style>
   <w:style w:type="paragraph" w:styleId="Header">

</xml_diff>